<commit_message>
Reword the remaining two 'this chapter' mentions
Section 3.8's dashboard description and Chapter Four's second
paragraph both used "this chapter" as an incidental aside. Reworded
both ("described above" / "reported below") for variety, completing
the pass on repetitive chapter-reference phrasing. Propagated to
every snapshot containing each paragraph.

Co-Authored-By: Claude Sonnet 5 <noreply@anthropic.com>
Claude-Session: https://claude.ai/code/session_01CtSjarowGcTD749UHkw1Xh
</commit_message>
<xml_diff>
--- a/docs/PROJECT_SUBMISSION_CH4.docx
+++ b/docs/PROJECT_SUBMISSION_CH4.docx
@@ -4568,7 +4568,7 @@
           <w:sz w:val="24"/>
           <w:szCs w:val="24"/>
         </w:rPr>
-        <w:t xml:space="preserve">The dashboard is a Next.js single-page application, statically exported and served at the site root, built exclusively from Shadcn UI components and theme tokens. It never talks to TraCI, PyTorch, or the scheduler directly; every piece of state it renders (current junction state, active phase, priority events, the model's recommendation next to the scheduler's actual decision, the historical decision log, and evaluation reports) is read from the internal FastAPI relay's /api/* endpoints, over a WebSocket for live simulation ticks and plain HTTP for snapshot and historical queries. Four pages make up the dashboard: Live State, which renders the junction itself on an interactive canvas (Section 3.8.1); Decision Log, a filterable, sortable table of every scheduler decision and its reason code; Evaluation, which runs and displays the intelligent-controller-versus-fixed-time-baseline comparison described in Section 3.9; and Methodology, a plain-language walkthrough of the pipeline in this chapter, included for a non-technical dashboard visitor.</w:t>
+        <w:t xml:space="preserve">The dashboard is a Next.js single-page application, statically exported and served at the site root, built exclusively from Shadcn UI components and theme tokens. It never talks to TraCI, PyTorch, or the scheduler directly; every piece of state it renders (current junction state, active phase, priority events, the model's recommendation next to the scheduler's actual decision, the historical decision log, and evaluation reports) is read from the internal FastAPI relay's /api/* endpoints, over a WebSocket for live simulation ticks and plain HTTP for snapshot and historical queries. Four pages make up the dashboard: Live State, which renders the junction itself on an interactive canvas (Section 3.8.1); Decision Log, a filterable, sortable table of every scheduler decision and its reason code; Evaluation, which runs and displays the intelligent-controller-versus-fixed-time-baseline comparison described in Section 3.9; and Methodology, a plain-language walkthrough of the pipeline described above, included for a non-technical dashboard visitor.</w:t>
       </w:r>
     </w:p>
     <w:p>
@@ -4905,7 +4905,7 @@
           <w:sz w:val="24"/>
           <w:szCs w:val="24"/>
         </w:rPr>
-        <w:t xml:space="preserve">Every stage of the pipeline described in Chapter Three was implemented and exercised end-to-end, from raw counts through to a live, evaluated dashboard, using the Typer command-line interface's pipeline subcommands: fit, calibrate, generate, train, run, evaluate, serve-api, and build-web. All results reported in this chapter were produced by actually running this pipeline against the calibrated Sapon Under-bridge Junction scenarios (a real SUMO simulation process controlled over TraCI, a real trained model checkpoint, and a real FastAPI relay and Next.js dashboard, not simulated or hand-authored output), so the figures and tables below are reproducible by re-running the same commands.</w:t>
+        <w:t xml:space="preserve">Every stage of the pipeline described in Chapter Three was implemented and exercised end-to-end, from raw counts through to a live, evaluated dashboard, using the Typer command-line interface's pipeline subcommands: fit, calibrate, generate, train, run, evaluate, serve-api, and build-web. All results reported below were produced by actually running this pipeline against the calibrated Sapon Under-bridge Junction scenarios (a real SUMO simulation process controlled over TraCI, a real trained model checkpoint, and a real FastAPI relay and Next.js dashboard, not simulated or hand-authored output), so the figures and tables below are reproducible by re-running the same commands.</w:t>
       </w:r>
     </w:p>
     <w:p>

</xml_diff>